<commit_message>
News layouts,add 3ddv add,refector
</commit_message>
<xml_diff>
--- a/public/template.docx
+++ b/public/template.docx
@@ -6,6 +6,17 @@
       <w:pPr>
         <w:jc w:val="center"/>
         <w:rPr>
+          <w:rFonts w:ascii="TH SarabunIT๙" w:hAnsi="TH SarabunIT๙" w:cs="TH SarabunIT๙"/>
+          <w:b/>
+          <w:bCs/>
+          <w:sz w:val="36"/>
+          <w:szCs w:val="36"/>
+          <w:cs/>
+          <w:lang w:eastAsia="en-US"/>
+        </w:rPr>
+      </w:pPr>
+      <w:r>
+        <w:rPr>
           <w:rFonts w:ascii="TH SarabunIT๙" w:hAnsi="TH SarabunIT๙" w:cs="TH SarabunIT๙" w:hint="cs"/>
           <w:b/>
           <w:bCs/>
@@ -14,7 +25,20 @@
           <w:cs/>
           <w:lang w:eastAsia="en-US"/>
         </w:rPr>
-      </w:pPr>
+        <w:t>รายละเอียดประกอบ</w:t>
+      </w:r>
+      <w:r>
+        <w:rPr>
+          <w:rFonts w:ascii="TH SarabunIT๙" w:hAnsi="TH SarabunIT๙" w:cs="TH SarabunIT๙"/>
+          <w:b/>
+          <w:bCs/>
+          <w:sz w:val="36"/>
+          <w:szCs w:val="36"/>
+          <w:cs/>
+          <w:lang w:eastAsia="en-US"/>
+        </w:rPr>
+        <w:t>ใบตรวจรับ</w:t>
+      </w:r>
       <w:r>
         <w:rPr>
           <w:rFonts w:ascii="TH SarabunIT๙" w:hAnsi="TH SarabunIT๙" w:cs="TH SarabunIT๙" w:hint="cs"/>
@@ -25,37 +49,298 @@
           <w:cs/>
           <w:lang w:eastAsia="en-US"/>
         </w:rPr>
-        <w:t>รายละเอียดประกอบ</w:t>
-      </w:r>
+        <w:t>พัสดุ</w:t>
+      </w:r>
+    </w:p>
+    <w:p>
+      <w:pPr>
+        <w:spacing w:before="120" w:after="120"/>
+        <w:jc w:val="thaiDistribute"/>
+        <w:rPr>
+          <w:rFonts w:ascii="TH SarabunIT๙" w:hAnsi="TH SarabunIT๙" w:cs="TH SarabunIT๙"/>
+          <w:sz w:val="32"/>
+          <w:szCs w:val="32"/>
+          <w:cs/>
+          <w:lang w:eastAsia="en-US"/>
+        </w:rPr>
+      </w:pPr>
+      <w:r>
+        <w:rPr>
+          <w:rFonts w:ascii="TH SarabunIT๙" w:hAnsi="TH SarabunIT๙" w:cs="TH SarabunIT๙" w:hint="cs"/>
+          <w:sz w:val="32"/>
+          <w:szCs w:val="32"/>
+          <w:cs/>
+          <w:lang w:eastAsia="en-US"/>
+        </w:rPr>
+        <w:tab/>
+      </w:r>
+      <w:r>
+        <w:rPr>
+          <w:rFonts w:ascii="TH SarabunIT๙" w:hAnsi="TH SarabunIT๙" w:cs="TH SarabunIT๙"/>
+          <w:sz w:val="32"/>
+          <w:szCs w:val="32"/>
+          <w:cs/>
+          <w:lang w:eastAsia="en-US"/>
+        </w:rPr>
+        <w:t>ประกอบการเบิกจ่ายเงิน</w:t>
+      </w:r>
+      <w:r>
+        <w:rPr>
+          <w:rFonts w:ascii="TH SarabunIT๙" w:hAnsi="TH SarabunIT๙" w:cs="TH SarabunIT๙" w:hint="cs"/>
+          <w:sz w:val="32"/>
+          <w:szCs w:val="32"/>
+          <w:cs/>
+          <w:lang w:eastAsia="en-US"/>
+        </w:rPr>
+        <w:t xml:space="preserve"> จ้างเหมาบริการ </w:t>
+      </w:r>
+      <w:r>
+        <w:rPr>
+          <w:rFonts w:ascii="TH SarabunIT๙" w:hAnsi="TH SarabunIT๙" w:cs="TH SarabunIT๙"/>
+          <w:sz w:val="32"/>
+          <w:szCs w:val="32"/>
+          <w:cs/>
+        </w:rPr>
+        <w:t xml:space="preserve">เพื่อช่วยปฏิบัติงานสุขาภิบาลและอนามัยสิ่งแวดล้อม </w:t>
+      </w:r>
+      <w:r>
+        <w:rPr>
+          <w:rFonts w:ascii="TH SarabunIT๙" w:hAnsi="TH SarabunIT๙" w:cs="TH SarabunIT๙" w:hint="cs"/>
+          <w:sz w:val="32"/>
+          <w:szCs w:val="32"/>
+          <w:cs/>
+          <w:lang w:eastAsia="en-US"/>
+        </w:rPr>
+        <w:t>ประจำเดือน</w:t>
+      </w:r>
+      <w:r>
+        <w:rPr>
+          <w:rFonts w:ascii="TH SarabunIT๙" w:hAnsi="TH SarabunIT๙" w:cs="TH SarabunIT๙" w:hint="cs"/>
+          <w:sz w:val="32"/>
+          <w:szCs w:val="32"/>
+          <w:cs/>
+          <w:lang w:eastAsia="en-US"/>
+        </w:rPr>
+        <w:t xml:space="preserve"> </w:t>
+      </w:r>
+      <w:r>
+        <w:rPr>
+          <w:rFonts w:ascii="TH SarabunIT๙" w:hAnsi="TH SarabunIT๙" w:cs="TH SarabunIT๙"/>
+          <w:color w:val="FF0000"/>
+          <w:sz w:val="32"/>
+          <w:szCs w:val="32"/>
+          <w:lang w:eastAsia="en-US"/>
+        </w:rPr>
+        <w:t>{</w:t>
+      </w:r>
+      <w:proofErr w:type="spellStart"/>
+      <w:r>
+        <w:rPr>
+          <w:rFonts w:ascii="TH SarabunIT๙" w:hAnsi="TH SarabunIT๙" w:cs="TH SarabunIT๙"/>
+          <w:color w:val="FF0000"/>
+          <w:sz w:val="32"/>
+          <w:szCs w:val="32"/>
+          <w:lang w:eastAsia="en-US"/>
+        </w:rPr>
+        <w:t>reportMonth</w:t>
+      </w:r>
+      <w:proofErr w:type="spellEnd"/>
+      <w:r>
+        <w:rPr>
+          <w:rFonts w:ascii="TH SarabunIT๙" w:hAnsi="TH SarabunIT๙" w:cs="TH SarabunIT๙"/>
+          <w:color w:val="FF0000"/>
+          <w:sz w:val="32"/>
+          <w:szCs w:val="32"/>
+          <w:lang w:eastAsia="en-US"/>
+        </w:rPr>
+        <w:t>}</w:t>
+      </w:r>
+    </w:p>
+    <w:p>
+      <w:pPr>
+        <w:spacing w:before="120"/>
+        <w:rPr>
+          <w:rFonts w:ascii="TH SarabunIT๙" w:hAnsi="TH SarabunIT๙" w:cs="TH SarabunIT๙"/>
+          <w:sz w:val="32"/>
+          <w:szCs w:val="32"/>
+          <w:lang w:eastAsia="en-US"/>
+        </w:rPr>
+      </w:pPr>
       <w:r>
         <w:rPr>
           <w:rFonts w:ascii="TH SarabunIT๙" w:hAnsi="TH SarabunIT๙" w:cs="TH SarabunIT๙"/>
           <w:b/>
           <w:bCs/>
-          <w:sz w:val="36"/>
-          <w:szCs w:val="36"/>
-          <w:cs/>
-          <w:lang w:eastAsia="en-US"/>
-        </w:rPr>
-        <w:t>ใบตรวจรับ</w:t>
-      </w:r>
-      <w:r>
-        <w:rPr>
-          <w:rFonts w:ascii="TH SarabunIT๙" w:hAnsi="TH SarabunIT๙" w:cs="TH SarabunIT๙" w:hint="cs"/>
+          <w:sz w:val="32"/>
+          <w:szCs w:val="32"/>
+          <w:cs/>
+          <w:lang w:eastAsia="en-US"/>
+        </w:rPr>
+        <w:tab/>
+      </w:r>
+      <w:r>
+        <w:rPr>
+          <w:rFonts w:ascii="TH SarabunIT๙" w:hAnsi="TH SarabunIT๙" w:cs="TH SarabunIT๙"/>
           <w:b/>
           <w:bCs/>
-          <w:sz w:val="36"/>
-          <w:szCs w:val="36"/>
-          <w:cs/>
-          <w:lang w:eastAsia="en-US"/>
-        </w:rPr>
-        <w:t>พัสดุ</w:t>
+          <w:sz w:val="32"/>
+          <w:szCs w:val="32"/>
+          <w:cs/>
+          <w:lang w:eastAsia="en-US"/>
+        </w:rPr>
+        <w:tab/>
+      </w:r>
+      <w:r>
+        <w:rPr>
+          <w:rFonts w:ascii="TH SarabunIT๙" w:hAnsi="TH SarabunIT๙" w:cs="TH SarabunIT๙"/>
+          <w:b/>
+          <w:bCs/>
+          <w:sz w:val="32"/>
+          <w:szCs w:val="32"/>
+          <w:cs/>
+          <w:lang w:eastAsia="en-US"/>
+        </w:rPr>
+        <w:tab/>
+      </w:r>
+      <w:r>
+        <w:rPr>
+          <w:rFonts w:ascii="TH SarabunIT๙" w:hAnsi="TH SarabunIT๙" w:cs="TH SarabunIT๙"/>
+          <w:b/>
+          <w:bCs/>
+          <w:sz w:val="32"/>
+          <w:szCs w:val="32"/>
+          <w:cs/>
+          <w:lang w:eastAsia="en-US"/>
+        </w:rPr>
+        <w:tab/>
+      </w:r>
+      <w:r>
+        <w:rPr>
+          <w:rFonts w:ascii="TH SarabunIT๙" w:hAnsi="TH SarabunIT๙" w:cs="TH SarabunIT๙"/>
+          <w:b/>
+          <w:bCs/>
+          <w:sz w:val="32"/>
+          <w:szCs w:val="32"/>
+          <w:cs/>
+          <w:lang w:eastAsia="en-US"/>
+        </w:rPr>
+        <w:tab/>
+      </w:r>
+      <w:r>
+        <w:rPr>
+          <w:rFonts w:ascii="TH SarabunIT๙" w:hAnsi="TH SarabunIT๙" w:cs="TH SarabunIT๙"/>
+          <w:b/>
+          <w:bCs/>
+          <w:sz w:val="32"/>
+          <w:szCs w:val="32"/>
+          <w:cs/>
+          <w:lang w:eastAsia="en-US"/>
+        </w:rPr>
+        <w:tab/>
+      </w:r>
+      <w:r>
+        <w:rPr>
+          <w:rFonts w:ascii="TH SarabunIT๙" w:hAnsi="TH SarabunIT๙" w:cs="TH SarabunIT๙"/>
+          <w:b/>
+          <w:bCs/>
+          <w:sz w:val="32"/>
+          <w:szCs w:val="32"/>
+          <w:cs/>
+          <w:lang w:eastAsia="en-US"/>
+        </w:rPr>
+        <w:tab/>
+      </w:r>
+      <w:r>
+        <w:rPr>
+          <w:rFonts w:ascii="TH SarabunIT๙" w:hAnsi="TH SarabunIT๙" w:cs="TH SarabunIT๙"/>
+          <w:sz w:val="32"/>
+          <w:szCs w:val="32"/>
+          <w:cs/>
+          <w:lang w:eastAsia="en-US"/>
+        </w:rPr>
+        <w:t>เขียนที่สำนักงานเทศบาลตำบลอุโมงค์</w:t>
       </w:r>
     </w:p>
     <w:p>
       <w:pPr>
-        <w:spacing w:before="120" w:after="120"/>
-        <w:jc w:val="thaiDistribute"/>
+        <w:rPr>
+          <w:rFonts w:ascii="TH SarabunIT๙" w:hAnsi="TH SarabunIT๙" w:cs="TH SarabunIT๙"/>
+          <w:sz w:val="32"/>
+          <w:szCs w:val="32"/>
+          <w:lang w:eastAsia="en-US"/>
+        </w:rPr>
+      </w:pPr>
+      <w:r>
+        <w:rPr>
+          <w:rFonts w:ascii="TH SarabunIT๙" w:hAnsi="TH SarabunIT๙" w:cs="TH SarabunIT๙"/>
+          <w:sz w:val="32"/>
+          <w:szCs w:val="32"/>
+          <w:cs/>
+          <w:lang w:eastAsia="en-US"/>
+        </w:rPr>
+        <w:tab/>
+      </w:r>
+      <w:r>
+        <w:rPr>
+          <w:rFonts w:ascii="TH SarabunIT๙" w:hAnsi="TH SarabunIT๙" w:cs="TH SarabunIT๙"/>
+          <w:sz w:val="32"/>
+          <w:szCs w:val="32"/>
+          <w:cs/>
+          <w:lang w:eastAsia="en-US"/>
+        </w:rPr>
+        <w:tab/>
+      </w:r>
+      <w:r>
+        <w:rPr>
+          <w:rFonts w:ascii="TH SarabunIT๙" w:hAnsi="TH SarabunIT๙" w:cs="TH SarabunIT๙"/>
+          <w:sz w:val="32"/>
+          <w:szCs w:val="32"/>
+          <w:cs/>
+          <w:lang w:eastAsia="en-US"/>
+        </w:rPr>
+        <w:tab/>
+      </w:r>
+      <w:r>
+        <w:rPr>
+          <w:rFonts w:ascii="TH SarabunIT๙" w:hAnsi="TH SarabunIT๙" w:cs="TH SarabunIT๙"/>
+          <w:sz w:val="32"/>
+          <w:szCs w:val="32"/>
+          <w:cs/>
+          <w:lang w:eastAsia="en-US"/>
+        </w:rPr>
+        <w:tab/>
+      </w:r>
+      <w:r>
+        <w:rPr>
+          <w:rFonts w:ascii="TH SarabunIT๙" w:hAnsi="TH SarabunIT๙" w:cs="TH SarabunIT๙"/>
+          <w:sz w:val="32"/>
+          <w:szCs w:val="32"/>
+          <w:cs/>
+          <w:lang w:eastAsia="en-US"/>
+        </w:rPr>
+        <w:tab/>
+      </w:r>
+      <w:r>
+        <w:rPr>
+          <w:rFonts w:ascii="TH SarabunIT๙" w:hAnsi="TH SarabunIT๙" w:cs="TH SarabunIT๙"/>
+          <w:sz w:val="32"/>
+          <w:szCs w:val="32"/>
+          <w:cs/>
+          <w:lang w:eastAsia="en-US"/>
+        </w:rPr>
+        <w:tab/>
+      </w:r>
+      <w:r>
+        <w:rPr>
+          <w:rFonts w:ascii="TH SarabunIT๙" w:hAnsi="TH SarabunIT๙" w:cs="TH SarabunIT๙"/>
+          <w:sz w:val="32"/>
+          <w:szCs w:val="32"/>
+          <w:cs/>
+          <w:lang w:eastAsia="en-US"/>
+        </w:rPr>
+        <w:tab/>
+      </w:r>
+      <w:r>
         <w:rPr>
           <w:rFonts w:ascii="TH SarabunIT๙" w:hAnsi="TH SarabunIT๙" w:cs="TH SarabunIT๙" w:hint="cs"/>
           <w:sz w:val="32"/>
@@ -63,7 +348,18 @@
           <w:cs/>
           <w:lang w:eastAsia="en-US"/>
         </w:rPr>
-      </w:pPr>
+        <w:t>234</w:t>
+      </w:r>
+      <w:r>
+        <w:rPr>
+          <w:rFonts w:ascii="TH SarabunIT๙" w:hAnsi="TH SarabunIT๙" w:cs="TH SarabunIT๙"/>
+          <w:sz w:val="32"/>
+          <w:szCs w:val="32"/>
+          <w:cs/>
+          <w:lang w:eastAsia="en-US"/>
+        </w:rPr>
+        <w:t xml:space="preserve"> หมู่ที่ </w:t>
+      </w:r>
       <w:r>
         <w:rPr>
           <w:rFonts w:ascii="TH SarabunIT๙" w:hAnsi="TH SarabunIT๙" w:cs="TH SarabunIT๙" w:hint="cs"/>
@@ -72,17 +368,17 @@
           <w:cs/>
           <w:lang w:eastAsia="en-US"/>
         </w:rPr>
-        <w:tab/>
-      </w:r>
-      <w:r>
-        <w:rPr>
-          <w:rFonts w:ascii="TH SarabunIT๙" w:hAnsi="TH SarabunIT๙" w:cs="TH SarabunIT๙"/>
-          <w:sz w:val="32"/>
-          <w:szCs w:val="32"/>
-          <w:cs/>
-          <w:lang w:eastAsia="en-US"/>
-        </w:rPr>
-        <w:t>ประกอบการเบิกจ่ายเงิน</w:t>
+        <w:t>5</w:t>
+      </w:r>
+      <w:r>
+        <w:rPr>
+          <w:rFonts w:ascii="TH SarabunIT๙" w:hAnsi="TH SarabunIT๙" w:cs="TH SarabunIT๙"/>
+          <w:sz w:val="32"/>
+          <w:szCs w:val="32"/>
+          <w:cs/>
+          <w:lang w:eastAsia="en-US"/>
+        </w:rPr>
+        <w:t xml:space="preserve">  ตำบลอุโมงค์  อำเภอ</w:t>
       </w:r>
       <w:r>
         <w:rPr>
@@ -92,309 +388,13 @@
           <w:cs/>
           <w:lang w:eastAsia="en-US"/>
         </w:rPr>
-        <w:t xml:space="preserve"> จ้างเหมาบริการ </w:t>
-      </w:r>
-      <w:r>
-        <w:rPr>
-          <w:rFonts w:ascii="TH SarabunIT๙" w:hAnsi="TH SarabunIT๙" w:cs="TH SarabunIT๙"/>
-          <w:sz w:val="32"/>
-          <w:szCs w:val="32"/>
-          <w:cs/>
-        </w:rPr>
-        <w:t xml:space="preserve">เพื่อช่วยปฏิบัติงานสุขาภิบาลและอนามัยสิ่งแวดล้อม </w:t>
-      </w:r>
-      <w:r>
-        <w:rPr>
-          <w:rFonts w:ascii="TH SarabunIT๙" w:hAnsi="TH SarabunIT๙" w:cs="TH SarabunIT๙" w:hint="cs"/>
-          <w:sz w:val="32"/>
-          <w:szCs w:val="32"/>
-          <w:cs/>
-          <w:lang w:eastAsia="en-US"/>
-        </w:rPr>
-        <w:t>ประจำเดือน</w:t>
-      </w:r>
-      <w:r>
-        <w:rPr>
-          <w:rFonts w:ascii="TH SarabunIT๙" w:hAnsi="TH SarabunIT๙" w:cs="TH SarabunIT๙" w:hint="cs"/>
-          <w:sz w:val="32"/>
-          <w:szCs w:val="32"/>
-          <w:cs/>
-          <w:lang w:eastAsia="en-US"/>
-        </w:rPr>
-        <w:t xml:space="preserve"> </w:t>
-      </w:r>
-      <w:r>
-        <w:rPr>
-          <w:rFonts w:ascii="TH SarabunIT๙" w:hAnsi="TH SarabunIT๙" w:cs="TH SarabunIT๙"/>
-          <w:color w:val="FF0000"/>
-          <w:sz w:val="32"/>
-          <w:szCs w:val="32"/>
-          <w:lang w:eastAsia="en-US"/>
-        </w:rPr>
-        <w:t>{</w:t>
-      </w:r>
-      <w:proofErr w:type="spellStart"/>
-      <w:r>
-        <w:rPr>
-          <w:rFonts w:ascii="TH SarabunIT๙" w:hAnsi="TH SarabunIT๙" w:cs="TH SarabunIT๙"/>
-          <w:color w:val="FF0000"/>
-          <w:sz w:val="32"/>
-          <w:szCs w:val="32"/>
-          <w:lang w:eastAsia="en-US"/>
-        </w:rPr>
-        <w:t>reportMonth</w:t>
-      </w:r>
-      <w:proofErr w:type="spellEnd"/>
-      <w:r>
-        <w:rPr>
-          <w:rFonts w:ascii="TH SarabunIT๙" w:hAnsi="TH SarabunIT๙" w:cs="TH SarabunIT๙"/>
-          <w:color w:val="FF0000"/>
-          <w:sz w:val="32"/>
-          <w:szCs w:val="32"/>
-          <w:lang w:eastAsia="en-US"/>
-        </w:rPr>
-        <w:t>}</w:t>
+        <w:t>เมืองลำพูน</w:t>
       </w:r>
     </w:p>
     <w:p>
       <w:pPr>
-        <w:spacing w:before="120"/>
-        <w:rPr>
-          <w:rFonts w:ascii="TH SarabunIT๙" w:hAnsi="TH SarabunIT๙" w:cs="TH SarabunIT๙"/>
-          <w:sz w:val="32"/>
-          <w:szCs w:val="32"/>
-          <w:lang w:eastAsia="en-US"/>
-        </w:rPr>
-      </w:pPr>
-      <w:r>
-        <w:rPr>
-          <w:rFonts w:ascii="TH SarabunIT๙" w:hAnsi="TH SarabunIT๙" w:cs="TH SarabunIT๙"/>
-          <w:b/>
-          <w:bCs/>
-          <w:sz w:val="32"/>
-          <w:szCs w:val="32"/>
-          <w:cs/>
-          <w:lang w:eastAsia="en-US"/>
-        </w:rPr>
-        <w:tab/>
-      </w:r>
-      <w:r>
-        <w:rPr>
-          <w:rFonts w:ascii="TH SarabunIT๙" w:hAnsi="TH SarabunIT๙" w:cs="TH SarabunIT๙"/>
-          <w:b/>
-          <w:bCs/>
-          <w:sz w:val="32"/>
-          <w:szCs w:val="32"/>
-          <w:cs/>
-          <w:lang w:eastAsia="en-US"/>
-        </w:rPr>
-        <w:tab/>
-      </w:r>
-      <w:r>
-        <w:rPr>
-          <w:rFonts w:ascii="TH SarabunIT๙" w:hAnsi="TH SarabunIT๙" w:cs="TH SarabunIT๙"/>
-          <w:b/>
-          <w:bCs/>
-          <w:sz w:val="32"/>
-          <w:szCs w:val="32"/>
-          <w:cs/>
-          <w:lang w:eastAsia="en-US"/>
-        </w:rPr>
-        <w:tab/>
-      </w:r>
-      <w:r>
-        <w:rPr>
-          <w:rFonts w:ascii="TH SarabunIT๙" w:hAnsi="TH SarabunIT๙" w:cs="TH SarabunIT๙"/>
-          <w:b/>
-          <w:bCs/>
-          <w:sz w:val="32"/>
-          <w:szCs w:val="32"/>
-          <w:cs/>
-          <w:lang w:eastAsia="en-US"/>
-        </w:rPr>
-        <w:tab/>
-      </w:r>
-      <w:r>
-        <w:rPr>
-          <w:rFonts w:ascii="TH SarabunIT๙" w:hAnsi="TH SarabunIT๙" w:cs="TH SarabunIT๙"/>
-          <w:b/>
-          <w:bCs/>
-          <w:sz w:val="32"/>
-          <w:szCs w:val="32"/>
-          <w:cs/>
-          <w:lang w:eastAsia="en-US"/>
-        </w:rPr>
-        <w:tab/>
-      </w:r>
-      <w:r>
-        <w:rPr>
-          <w:rFonts w:ascii="TH SarabunIT๙" w:hAnsi="TH SarabunIT๙" w:cs="TH SarabunIT๙"/>
-          <w:b/>
-          <w:bCs/>
-          <w:sz w:val="32"/>
-          <w:szCs w:val="32"/>
-          <w:cs/>
-          <w:lang w:eastAsia="en-US"/>
-        </w:rPr>
-        <w:tab/>
-      </w:r>
-      <w:r>
-        <w:rPr>
-          <w:rFonts w:ascii="TH SarabunIT๙" w:hAnsi="TH SarabunIT๙" w:cs="TH SarabunIT๙"/>
-          <w:b/>
-          <w:bCs/>
-          <w:sz w:val="32"/>
-          <w:szCs w:val="32"/>
-          <w:cs/>
-          <w:lang w:eastAsia="en-US"/>
-        </w:rPr>
-        <w:tab/>
-      </w:r>
-      <w:r>
-        <w:rPr>
-          <w:rFonts w:ascii="TH SarabunIT๙" w:hAnsi="TH SarabunIT๙" w:cs="TH SarabunIT๙"/>
-          <w:sz w:val="32"/>
-          <w:szCs w:val="32"/>
-          <w:cs/>
-          <w:lang w:eastAsia="en-US"/>
-        </w:rPr>
-        <w:t>เขียนที่สำนักงานเทศบาลตำบลอุโมงค์</w:t>
-      </w:r>
-    </w:p>
-    <w:p>
-      <w:pPr>
-        <w:rPr>
-          <w:rFonts w:ascii="TH SarabunIT๙" w:hAnsi="TH SarabunIT๙" w:cs="TH SarabunIT๙"/>
-          <w:sz w:val="32"/>
-          <w:szCs w:val="32"/>
-          <w:lang w:eastAsia="en-US"/>
-        </w:rPr>
-      </w:pPr>
-      <w:r>
-        <w:rPr>
-          <w:rFonts w:ascii="TH SarabunIT๙" w:hAnsi="TH SarabunIT๙" w:cs="TH SarabunIT๙"/>
-          <w:sz w:val="32"/>
-          <w:szCs w:val="32"/>
-          <w:cs/>
-          <w:lang w:eastAsia="en-US"/>
-        </w:rPr>
-        <w:tab/>
-      </w:r>
-      <w:r>
-        <w:rPr>
-          <w:rFonts w:ascii="TH SarabunIT๙" w:hAnsi="TH SarabunIT๙" w:cs="TH SarabunIT๙"/>
-          <w:sz w:val="32"/>
-          <w:szCs w:val="32"/>
-          <w:cs/>
-          <w:lang w:eastAsia="en-US"/>
-        </w:rPr>
-        <w:tab/>
-      </w:r>
-      <w:r>
-        <w:rPr>
-          <w:rFonts w:ascii="TH SarabunIT๙" w:hAnsi="TH SarabunIT๙" w:cs="TH SarabunIT๙"/>
-          <w:sz w:val="32"/>
-          <w:szCs w:val="32"/>
-          <w:cs/>
-          <w:lang w:eastAsia="en-US"/>
-        </w:rPr>
-        <w:tab/>
-      </w:r>
-      <w:r>
-        <w:rPr>
-          <w:rFonts w:ascii="TH SarabunIT๙" w:hAnsi="TH SarabunIT๙" w:cs="TH SarabunIT๙"/>
-          <w:sz w:val="32"/>
-          <w:szCs w:val="32"/>
-          <w:cs/>
-          <w:lang w:eastAsia="en-US"/>
-        </w:rPr>
-        <w:tab/>
-      </w:r>
-      <w:r>
-        <w:rPr>
-          <w:rFonts w:ascii="TH SarabunIT๙" w:hAnsi="TH SarabunIT๙" w:cs="TH SarabunIT๙"/>
-          <w:sz w:val="32"/>
-          <w:szCs w:val="32"/>
-          <w:cs/>
-          <w:lang w:eastAsia="en-US"/>
-        </w:rPr>
-        <w:tab/>
-      </w:r>
-      <w:r>
-        <w:rPr>
-          <w:rFonts w:ascii="TH SarabunIT๙" w:hAnsi="TH SarabunIT๙" w:cs="TH SarabunIT๙"/>
-          <w:sz w:val="32"/>
-          <w:szCs w:val="32"/>
-          <w:cs/>
-          <w:lang w:eastAsia="en-US"/>
-        </w:rPr>
-        <w:tab/>
-      </w:r>
-      <w:r>
-        <w:rPr>
-          <w:rFonts w:ascii="TH SarabunIT๙" w:hAnsi="TH SarabunIT๙" w:cs="TH SarabunIT๙"/>
-          <w:sz w:val="32"/>
-          <w:szCs w:val="32"/>
-          <w:cs/>
-          <w:lang w:eastAsia="en-US"/>
-        </w:rPr>
-        <w:tab/>
-      </w:r>
-      <w:r>
-        <w:rPr>
-          <w:rFonts w:ascii="TH SarabunIT๙" w:hAnsi="TH SarabunIT๙" w:cs="TH SarabunIT๙" w:hint="cs"/>
-          <w:sz w:val="32"/>
-          <w:szCs w:val="32"/>
-          <w:cs/>
-          <w:lang w:eastAsia="en-US"/>
-        </w:rPr>
-        <w:t>234</w:t>
-      </w:r>
-      <w:r>
-        <w:rPr>
-          <w:rFonts w:ascii="TH SarabunIT๙" w:hAnsi="TH SarabunIT๙" w:cs="TH SarabunIT๙"/>
-          <w:sz w:val="32"/>
-          <w:szCs w:val="32"/>
-          <w:cs/>
-          <w:lang w:eastAsia="en-US"/>
-        </w:rPr>
-        <w:t xml:space="preserve"> หมู่ที่ </w:t>
-      </w:r>
-      <w:r>
-        <w:rPr>
-          <w:rFonts w:ascii="TH SarabunIT๙" w:hAnsi="TH SarabunIT๙" w:cs="TH SarabunIT๙" w:hint="cs"/>
-          <w:sz w:val="32"/>
-          <w:szCs w:val="32"/>
-          <w:cs/>
-          <w:lang w:eastAsia="en-US"/>
-        </w:rPr>
-        <w:t>5</w:t>
-      </w:r>
-      <w:r>
-        <w:rPr>
-          <w:rFonts w:ascii="TH SarabunIT๙" w:hAnsi="TH SarabunIT๙" w:cs="TH SarabunIT๙"/>
-          <w:sz w:val="32"/>
-          <w:szCs w:val="32"/>
-          <w:cs/>
-          <w:lang w:eastAsia="en-US"/>
-        </w:rPr>
-        <w:t xml:space="preserve">  ตำบลอุโมงค์  อำเภอ</w:t>
-      </w:r>
-      <w:r>
-        <w:rPr>
-          <w:rFonts w:ascii="TH SarabunIT๙" w:hAnsi="TH SarabunIT๙" w:cs="TH SarabunIT๙" w:hint="cs"/>
-          <w:sz w:val="32"/>
-          <w:szCs w:val="32"/>
-          <w:cs/>
-          <w:lang w:eastAsia="en-US"/>
-        </w:rPr>
-        <w:t>เมืองลำพูน</w:t>
-      </w:r>
-    </w:p>
-    <w:p>
-      <w:pPr>
-        <w:rPr>
-          <w:rFonts w:ascii="TH SarabunIT๙" w:hAnsi="TH SarabunIT๙" w:cs="TH SarabunIT๙" w:hint="cs"/>
+        <w:rPr>
+          <w:rFonts w:ascii="TH SarabunIT๙" w:hAnsi="TH SarabunIT๙" w:cs="TH SarabunIT๙"/>
           <w:sz w:val="32"/>
           <w:szCs w:val="32"/>
           <w:cs/>
@@ -1110,6 +1110,9 @@
         <w:gridCol w:w="1134"/>
       </w:tblGrid>
       <w:tr>
+        <w:trPr>
+          <w:tblHeader/>
+        </w:trPr>
         <w:tc>
           <w:tcPr>
             <w:tcW w:w="2376" w:type="dxa"/>
@@ -1142,7 +1145,7 @@
             <w:pPr>
               <w:jc w:val="center"/>
               <w:rPr>
-                <w:rFonts w:ascii="TH SarabunIT๙" w:hAnsi="TH SarabunIT๙" w:cs="TH SarabunIT๙" w:hint="cs"/>
+                <w:rFonts w:ascii="TH SarabunIT๙" w:hAnsi="TH SarabunIT๙" w:cs="TH SarabunIT๙"/>
                 <w:sz w:val="32"/>
                 <w:szCs w:val="32"/>
                 <w:cs/>
@@ -1197,7 +1200,7 @@
             <w:pPr>
               <w:jc w:val="center"/>
               <w:rPr>
-                <w:rFonts w:ascii="TH SarabunIT๙" w:hAnsi="TH SarabunIT๙" w:cs="TH SarabunIT๙" w:hint="cs"/>
+                <w:rFonts w:ascii="TH SarabunIT๙" w:hAnsi="TH SarabunIT๙" w:cs="TH SarabunIT๙"/>
                 <w:sz w:val="32"/>
                 <w:szCs w:val="32"/>
                 <w:cs/>
@@ -1274,7 +1277,7 @@
           <w:p>
             <w:pPr>
               <w:rPr>
-                <w:rFonts w:ascii="TH SarabunIT๙" w:hAnsi="TH SarabunIT๙" w:cs="TH SarabunIT๙"/>
+                <w:rFonts w:ascii="TH SarabunIT๙" w:hAnsi="TH SarabunIT๙" w:cs="TH SarabunIT๙" w:hint="cs"/>
                 <w:sz w:val="32"/>
                 <w:szCs w:val="32"/>
                 <w:cs/>
@@ -1384,8 +1387,6 @@
         </w:rPr>
         <w:t>ผู้ตรวจรับพัสดุ</w:t>
       </w:r>
-      <w:bookmarkStart w:id="0" w:name="_GoBack"/>
-      <w:bookmarkEnd w:id="0"/>
     </w:p>
     <w:p>
       <w:pPr>
@@ -1393,7 +1394,7 @@
         <w:ind w:firstLine="709"/>
         <w:jc w:val="thaiDistribute"/>
         <w:rPr>
-          <w:rFonts w:ascii="TH SarabunIT๙" w:hAnsi="TH SarabunIT๙" w:cs="TH SarabunIT๙" w:hint="cs"/>
+          <w:rFonts w:ascii="TH SarabunIT๙" w:hAnsi="TH SarabunIT๙" w:cs="TH SarabunIT๙"/>
           <w:sz w:val="32"/>
           <w:szCs w:val="32"/>
           <w:cs/>
@@ -1524,6 +1525,8 @@
         </w:rPr>
         <w:tab/>
       </w:r>
+      <w:bookmarkStart w:id="0" w:name="_GoBack"/>
+      <w:bookmarkEnd w:id="0"/>
     </w:p>
     <w:p>
       <w:pPr>
@@ -1747,99 +1750,14 @@
         <w:t>}</w:t>
       </w:r>
     </w:p>
-    <w:p>
-      <w:pPr>
-        <w:jc w:val="both"/>
-        <w:rPr>
-          <w:rFonts w:ascii="TH SarabunIT๙" w:hAnsi="TH SarabunIT๙" w:cs="TH SarabunIT๙"/>
-          <w:sz w:val="32"/>
-          <w:szCs w:val="32"/>
-          <w:lang w:eastAsia="en-US"/>
-        </w:rPr>
-      </w:pPr>
-    </w:p>
-    <w:p>
-      <w:pPr>
-        <w:jc w:val="both"/>
-        <w:rPr>
-          <w:rFonts w:ascii="TH SarabunIT๙" w:hAnsi="TH SarabunIT๙" w:cs="TH SarabunIT๙"/>
-          <w:sz w:val="32"/>
-          <w:szCs w:val="32"/>
-          <w:lang w:eastAsia="en-US"/>
-        </w:rPr>
-      </w:pPr>
-    </w:p>
-    <w:p>
-      <w:pPr>
-        <w:jc w:val="both"/>
-        <w:rPr>
-          <w:rFonts w:ascii="TH SarabunIT๙" w:hAnsi="TH SarabunIT๙" w:cs="TH SarabunIT๙"/>
-          <w:sz w:val="32"/>
-          <w:szCs w:val="32"/>
-          <w:lang w:eastAsia="en-US"/>
-        </w:rPr>
-      </w:pPr>
-    </w:p>
-    <w:p>
-      <w:pPr>
-        <w:jc w:val="both"/>
-        <w:rPr>
-          <w:rFonts w:ascii="TH SarabunIT๙" w:hAnsi="TH SarabunIT๙" w:cs="TH SarabunIT๙"/>
-          <w:sz w:val="32"/>
-          <w:szCs w:val="32"/>
-          <w:lang w:eastAsia="en-US"/>
-        </w:rPr>
-      </w:pPr>
-    </w:p>
-    <w:p>
-      <w:pPr>
-        <w:jc w:val="both"/>
-        <w:rPr>
-          <w:rFonts w:ascii="TH SarabunIT๙" w:hAnsi="TH SarabunIT๙" w:cs="TH SarabunIT๙"/>
-          <w:sz w:val="32"/>
-          <w:szCs w:val="32"/>
-          <w:lang w:eastAsia="en-US"/>
-        </w:rPr>
-      </w:pPr>
-    </w:p>
-    <w:p>
-      <w:pPr>
-        <w:jc w:val="both"/>
-        <w:rPr>
-          <w:rFonts w:ascii="TH SarabunIT๙" w:hAnsi="TH SarabunIT๙" w:cs="TH SarabunIT๙"/>
-          <w:sz w:val="32"/>
-          <w:szCs w:val="32"/>
-          <w:lang w:eastAsia="en-US"/>
-        </w:rPr>
-      </w:pPr>
-    </w:p>
-    <w:p>
-      <w:pPr>
-        <w:jc w:val="both"/>
-        <w:rPr>
-          <w:rFonts w:ascii="TH SarabunIT๙" w:hAnsi="TH SarabunIT๙" w:cs="TH SarabunIT๙"/>
-          <w:sz w:val="32"/>
-          <w:szCs w:val="32"/>
-          <w:lang w:eastAsia="en-US"/>
-        </w:rPr>
-      </w:pPr>
-    </w:p>
-    <w:p>
-      <w:pPr>
-        <w:jc w:val="both"/>
-        <w:rPr>
-          <w:rFonts w:ascii="TH SarabunIT๙" w:hAnsi="TH SarabunIT๙" w:cs="TH SarabunIT๙"/>
-          <w:sz w:val="32"/>
-          <w:szCs w:val="32"/>
-          <w:lang w:eastAsia="en-US"/>
-        </w:rPr>
-      </w:pPr>
-    </w:p>
     <w:sectPr>
+      <w:headerReference w:type="default" r:id="rId9"/>
       <w:pgSz w:w="11906" w:h="16838"/>
       <w:pgMar w:top="709" w:right="991" w:bottom="993" w:left="1560" w:header="709" w:footer="709" w:gutter="0"/>
+      <w:pgNumType w:fmt="thaiNumbers" w:start="1"/>
       <w:cols w:space="708"/>
-      <w:docGrid w:linePitch="360"/>
+      <w:titlePg/>
+      <w:docGrid w:linePitch="381"/>
     </w:sectPr>
   </w:body>
 </w:document>
@@ -1881,6 +1799,88 @@
     </w:p>
   </w:footnote>
 </w:footnotes>
+</file>
+
+<file path=word/header1.xml><?xml version="1.0" encoding="utf-8"?>
+<w:hdr xmlns:wpc="http://schemas.microsoft.com/office/word/2010/wordprocessingCanvas" xmlns:mc="http://schemas.openxmlformats.org/markup-compatibility/2006" xmlns:o="urn:schemas-microsoft-com:office:office" xmlns:r="http://schemas.openxmlformats.org/officeDocument/2006/relationships" xmlns:m="http://schemas.openxmlformats.org/officeDocument/2006/math" xmlns:v="urn:schemas-microsoft-com:vml" xmlns:wp14="http://schemas.microsoft.com/office/word/2010/wordprocessingDrawing" xmlns:wp="http://schemas.openxmlformats.org/drawingml/2006/wordprocessingDrawing" xmlns:w10="urn:schemas-microsoft-com:office:word" xmlns:w="http://schemas.openxmlformats.org/wordprocessingml/2006/main" xmlns:w14="http://schemas.microsoft.com/office/word/2010/wordml" xmlns:wpg="http://schemas.microsoft.com/office/word/2010/wordprocessingGroup" xmlns:wpi="http://schemas.microsoft.com/office/word/2010/wordprocessingInk" xmlns:wne="http://schemas.microsoft.com/office/word/2006/wordml" xmlns:wps="http://schemas.microsoft.com/office/word/2010/wordprocessingShape" mc:Ignorable="w14 wp14">
+  <w:sdt>
+    <w:sdtPr>
+      <w:id w:val="656117242"/>
+      <w:docPartObj>
+        <w:docPartGallery w:val="Page Numbers (Top of Page)"/>
+        <w:docPartUnique/>
+      </w:docPartObj>
+    </w:sdtPr>
+    <w:sdtEndPr>
+      <w:rPr>
+        <w:sz w:val="32"/>
+        <w:szCs w:val="32"/>
+      </w:rPr>
+    </w:sdtEndPr>
+    <w:sdtContent>
+      <w:p>
+        <w:pPr>
+          <w:pStyle w:val="ad"/>
+          <w:jc w:val="center"/>
+          <w:rPr>
+            <w:sz w:val="32"/>
+            <w:szCs w:val="32"/>
+          </w:rPr>
+        </w:pPr>
+        <w:r>
+          <w:rPr>
+            <w:rFonts w:asciiTheme="minorHAnsi" w:hAnsiTheme="minorHAnsi"/>
+            <w:sz w:val="32"/>
+            <w:szCs w:val="32"/>
+            <w:lang w:val="en-US"/>
+          </w:rPr>
+          <w:t xml:space="preserve">- </w:t>
+        </w:r>
+        <w:r>
+          <w:rPr>
+            <w:rStyle w:val="af1"/>
+          </w:rPr>
+          <w:fldChar w:fldCharType="begin"/>
+        </w:r>
+        <w:r>
+          <w:rPr>
+            <w:rStyle w:val="af1"/>
+          </w:rPr>
+          <w:instrText xml:space="preserve"> PAGE </w:instrText>
+        </w:r>
+        <w:r>
+          <w:rPr>
+            <w:rStyle w:val="af1"/>
+          </w:rPr>
+          <w:fldChar w:fldCharType="separate"/>
+        </w:r>
+        <w:r>
+          <w:rPr>
+            <w:rStyle w:val="af1"/>
+            <w:noProof/>
+            <w:cs/>
+          </w:rPr>
+          <w:t>๒</w:t>
+        </w:r>
+        <w:r>
+          <w:rPr>
+            <w:rStyle w:val="af1"/>
+          </w:rPr>
+          <w:fldChar w:fldCharType="end"/>
+        </w:r>
+        <w:r>
+          <w:rPr>
+            <w:rFonts w:asciiTheme="minorHAnsi" w:hAnsiTheme="minorHAnsi"/>
+            <w:sz w:val="32"/>
+            <w:szCs w:val="32"/>
+            <w:lang w:val="en-US"/>
+          </w:rPr>
+          <w:t xml:space="preserve"> -</w:t>
+        </w:r>
+      </w:p>
+    </w:sdtContent>
+  </w:sdt>
+</w:hdr>
 </file>
 
 <file path=word/numbering.xml><?xml version="1.0" encoding="utf-8"?>
@@ -3422,6 +3422,7 @@
     <w:lsdException w:name="heading 7" w:qFormat="1"/>
     <w:lsdException w:name="heading 8" w:semiHidden="1" w:unhideWhenUsed="1" w:qFormat="1"/>
     <w:lsdException w:name="heading 9" w:qFormat="1"/>
+    <w:lsdException w:name="header" w:uiPriority="99"/>
     <w:lsdException w:name="caption" w:semiHidden="1" w:unhideWhenUsed="1" w:qFormat="1"/>
     <w:lsdException w:name="Title" w:qFormat="1"/>
     <w:lsdException w:name="Subtitle" w:qFormat="1"/>
@@ -3698,11 +3699,15 @@
   </w:style>
   <w:style w:type="character" w:default="1" w:styleId="a0">
     <w:name w:val="Default Paragraph Font"/>
+    <w:uiPriority w:val="1"/>
     <w:semiHidden/>
+    <w:unhideWhenUsed/>
   </w:style>
   <w:style w:type="table" w:default="1" w:styleId="a1">
     <w:name w:val="Normal Table"/>
+    <w:uiPriority w:val="99"/>
     <w:semiHidden/>
+    <w:unhideWhenUsed/>
     <w:tblPr>
       <w:tblInd w:w="0" w:type="dxa"/>
       <w:tblCellMar>
@@ -3715,7 +3720,9 @@
   </w:style>
   <w:style w:type="numbering" w:default="1" w:styleId="a2">
     <w:name w:val="No List"/>
+    <w:uiPriority w:val="99"/>
     <w:semiHidden/>
+    <w:unhideWhenUsed/>
   </w:style>
   <w:style w:type="paragraph" w:styleId="a3">
     <w:name w:val="Body Text"/>
@@ -3854,6 +3861,7 @@
       <w:szCs w:val="28"/>
     </w:rPr>
     <w:tblPr>
+      <w:tblInd w:w="0" w:type="dxa"/>
       <w:tblBorders>
         <w:top w:val="single" w:sz="4" w:space="0" w:color="auto"/>
         <w:left w:val="single" w:sz="4" w:space="0" w:color="auto"/>
@@ -3933,6 +3941,7 @@
     <w:name w:val="header"/>
     <w:basedOn w:val="a"/>
     <w:link w:val="ae"/>
+    <w:uiPriority w:val="99"/>
     <w:rsid w:val="00536353"/>
     <w:pPr>
       <w:tabs>
@@ -3948,6 +3957,7 @@
   <w:style w:type="character" w:customStyle="1" w:styleId="ae">
     <w:name w:val="หัวกระดาษ อักขระ"/>
     <w:link w:val="ad"/>
+    <w:uiPriority w:val="99"/>
     <w:rsid w:val="00536353"/>
     <w:rPr>
       <w:rFonts w:ascii="Cordia New" w:eastAsia="Cordia New" w:hAnsi="Cordia New"/>
@@ -3982,6 +3992,11 @@
       <w:szCs w:val="35"/>
       <w:lang w:eastAsia="zh-CN"/>
     </w:rPr>
+  </w:style>
+  <w:style w:type="character" w:styleId="af1">
+    <w:name w:val="page number"/>
+    <w:basedOn w:val="a0"/>
+    <w:rsid w:val="00AE24F2"/>
   </w:style>
 </w:styles>
 </file>
@@ -4008,6 +4023,7 @@
     <w:lsdException w:name="heading 7" w:qFormat="1"/>
     <w:lsdException w:name="heading 8" w:semiHidden="1" w:unhideWhenUsed="1" w:qFormat="1"/>
     <w:lsdException w:name="heading 9" w:qFormat="1"/>
+    <w:lsdException w:name="header" w:uiPriority="99"/>
     <w:lsdException w:name="caption" w:semiHidden="1" w:unhideWhenUsed="1" w:qFormat="1"/>
     <w:lsdException w:name="Title" w:qFormat="1"/>
     <w:lsdException w:name="Subtitle" w:qFormat="1"/>
@@ -4284,11 +4300,15 @@
   </w:style>
   <w:style w:type="character" w:default="1" w:styleId="a0">
     <w:name w:val="Default Paragraph Font"/>
+    <w:uiPriority w:val="1"/>
     <w:semiHidden/>
+    <w:unhideWhenUsed/>
   </w:style>
   <w:style w:type="table" w:default="1" w:styleId="a1">
     <w:name w:val="Normal Table"/>
+    <w:uiPriority w:val="99"/>
     <w:semiHidden/>
+    <w:unhideWhenUsed/>
     <w:tblPr>
       <w:tblInd w:w="0" w:type="dxa"/>
       <w:tblCellMar>
@@ -4301,7 +4321,9 @@
   </w:style>
   <w:style w:type="numbering" w:default="1" w:styleId="a2">
     <w:name w:val="No List"/>
+    <w:uiPriority w:val="99"/>
     <w:semiHidden/>
+    <w:unhideWhenUsed/>
   </w:style>
   <w:style w:type="paragraph" w:styleId="a3">
     <w:name w:val="Body Text"/>
@@ -4440,6 +4462,7 @@
       <w:szCs w:val="28"/>
     </w:rPr>
     <w:tblPr>
+      <w:tblInd w:w="0" w:type="dxa"/>
       <w:tblBorders>
         <w:top w:val="single" w:sz="4" w:space="0" w:color="auto"/>
         <w:left w:val="single" w:sz="4" w:space="0" w:color="auto"/>
@@ -4519,6 +4542,7 @@
     <w:name w:val="header"/>
     <w:basedOn w:val="a"/>
     <w:link w:val="ae"/>
+    <w:uiPriority w:val="99"/>
     <w:rsid w:val="00536353"/>
     <w:pPr>
       <w:tabs>
@@ -4534,6 +4558,7 @@
   <w:style w:type="character" w:customStyle="1" w:styleId="ae">
     <w:name w:val="หัวกระดาษ อักขระ"/>
     <w:link w:val="ad"/>
+    <w:uiPriority w:val="99"/>
     <w:rsid w:val="00536353"/>
     <w:rPr>
       <w:rFonts w:ascii="Cordia New" w:eastAsia="Cordia New" w:hAnsi="Cordia New"/>
@@ -4568,6 +4593,11 @@
       <w:szCs w:val="35"/>
       <w:lang w:eastAsia="zh-CN"/>
     </w:rPr>
+  </w:style>
+  <w:style w:type="character" w:styleId="af1">
+    <w:name w:val="page number"/>
+    <w:basedOn w:val="a0"/>
+    <w:rsid w:val="00AE24F2"/>
   </w:style>
 </w:styles>
 </file>
@@ -4862,7 +4892,7 @@
 </file>
 
 <file path=customXml/itemProps1.xml><?xml version="1.0" encoding="utf-8"?>
-<ds:datastoreItem xmlns:ds="http://schemas.openxmlformats.org/officeDocument/2006/customXml" ds:itemID="{86EB005A-DA43-481B-A4BE-B0EB271EDF31}">
+<ds:datastoreItem xmlns:ds="http://schemas.openxmlformats.org/officeDocument/2006/customXml" ds:itemID="{82B84A97-2CE3-470B-8D2F-25FD88B811C3}">
   <ds:schemaRefs>
     <ds:schemaRef ds:uri="http://schemas.openxmlformats.org/officeDocument/2006/bibliography"/>
   </ds:schemaRefs>

</xml_diff>